<commit_message>
feat(18d): sync updated 18D panoramic spectrogram and chained catalog to web assets
</commit_message>
<xml_diff>
--- a/assets/TABLAS_Y_GRAFICOS_ENCADENADOS_NEXORD.docx
+++ b/assets/TABLAS_Y_GRAFICOS_ENCADENADOS_NEXORD.docx
@@ -1045,6 +1045,330 @@
           <w:color w:val="351304"/>
         </w:rPr>
         <w:t xml:space="preserve"> Gráfico canónico de alta precisión actualizado en paleta crema editorial (#FDFBF7), verificando el cálculo exacto de cada balance sin confusión con SDA/SRC.</w:t>
+      </w:r>
+      <w:r>
+        <w:rPr>
+          <w:rFonts w:ascii="Helvetica Neue" w:hAnsi="Helvetica Neue" w:cs="Helvetica Neue"/>
+          <w:sz w:val="25"/>
+          <w:sz-cs w:val="25"/>
+          <w:spacing w:val="0"/>
+          <w:color w:val="351304"/>
+        </w:rPr>
+        <w:t xml:space="preserve"/>
+      </w:r>
+    </w:p>
+    <w:p>
+      <w:pPr/>
+      <w:r>
+        <w:rPr>
+          <w:rFonts w:ascii=".SF NS" w:hAnsi=".SF NS" w:cs=".SF NS"/>
+          <w:sz w:val="24"/>
+          <w:sz-cs w:val="24"/>
+          <w:b/>
+          <w:spacing w:val="0"/>
+          <w:color w:val="13645B"/>
+        </w:rPr>
+        <w:t xml:space="preserve">GRÁFICA COMPUESTA 18D (EDICIÓN IMPRESA / CREMA)</w:t>
+      </w:r>
+    </w:p>
+    <w:p>
+      <w:pPr/>
+      <w:r>
+        <w:rPr>
+          <w:rFonts w:ascii=".SF NS" w:hAnsi=".SF NS" w:cs=".SF NS"/>
+          <w:sz w:val="26"/>
+          <w:sz-cs w:val="26"/>
+          <w:b/>
+          <w:spacing w:val="0"/>
+          <w:color w:val="526078"/>
+        </w:rPr>
+        <w:t xml:space="preserve">Sección 4.4.1 y 4.4.2: Las 18 Densidades Relacionales y Desniveles de Tensión (Δ)</w:t>
+      </w:r>
+      <w:r>
+        <w:rPr>
+          <w:rFonts w:ascii=".SF NS" w:hAnsi=".SF NS" w:cs=".SF NS"/>
+          <w:sz w:val="26"/>
+          <w:sz-cs w:val="26"/>
+          <w:b/>
+          <w:spacing w:val="0"/>
+          <w:color w:val="526078"/>
+        </w:rPr>
+        <w:t xml:space="preserve"/>
+      </w:r>
+    </w:p>
+    <w:p>
+      <w:pPr/>
+      <w:r>
+        <w:rPr>
+          <w:rFonts w:ascii="Helvetica Neue" w:hAnsi="Helvetica Neue" w:cs="Helvetica Neue"/>
+          <w:sz w:val="40"/>
+          <w:sz-cs w:val="40"/>
+          <w:b/>
+          <w:spacing w:val="0"/>
+          <w:color w:val="171E2D"/>
+        </w:rPr>
+        <w:t xml:space="preserve">Gráfica Compuesta 18D. Espectrograma Panorámico de la Energía Vincular (B12 S12 · B14 S14 ...)</w:t>
+      </w:r>
+      <w:r>
+        <w:rPr>
+          <w:rFonts w:ascii="Helvetica Neue" w:hAnsi="Helvetica Neue" w:cs="Helvetica Neue"/>
+          <w:sz w:val="40"/>
+          <w:sz-cs w:val="40"/>
+          <w:b/>
+          <w:spacing w:val="0"/>
+          <w:color w:val="171E2D"/>
+        </w:rPr>
+        <w:t xml:space="preserve"/>
+      </w:r>
+    </w:p>
+    <w:p>
+      <w:pPr>
+        <w:jc w:val="center"/>
+      </w:pPr>
+      <w:r>
+        <w:rPr>
+          <w:rFonts w:ascii="Helvetica Neue" w:hAnsi="Helvetica Neue" w:cs="Helvetica Neue"/>
+          <w:sz w:val="24"/>
+          <w:sz-cs w:val="24"/>
+          <w:spacing w:val="0"/>
+          <w:color w:val="0D121F"/>
+        </w:rPr>
+        <w:t xml:space="preserve"/>
+      </w:r>
+      <w:r>
+        <w:rPr>
+          <w:rFonts w:ascii="Helvetica Neue" w:hAnsi="Helvetica Neue" w:cs="Helvetica Neue"/>
+          <w:sz w:val="24"/>
+          <w:sz-cs w:val="24"/>
+          <w:spacing w:val="0"/>
+          <w:color w:val="0D121F"/>
+        </w:rPr>
+        <w:t xml:space="preserve"/>
+      </w:r>
+    </w:p>
+    <w:p>
+      <w:pPr>
+        <w:spacing w:after="160"/>
+      </w:pPr>
+      <w:r>
+        <w:rPr>
+          <w:rFonts w:ascii="Helvetica Neue" w:hAnsi="Helvetica Neue" w:cs="Helvetica Neue"/>
+          <w:sz w:val="27"/>
+          <w:sz-cs w:val="27"/>
+          <w:b/>
+          <w:i/>
+          <w:spacing w:val="0"/>
+          <w:color w:val="64270E"/>
+        </w:rPr>
+        <w:t xml:space="preserve">Leyenda oficial:</w:t>
+      </w:r>
+      <w:r>
+        <w:rPr>
+          <w:rFonts w:ascii="Helvetica Neue" w:hAnsi="Helvetica Neue" w:cs="Helvetica Neue"/>
+          <w:sz w:val="27"/>
+          <w:sz-cs w:val="27"/>
+          <w:i/>
+          <w:spacing w:val="0"/>
+          <w:color w:val="64270E"/>
+        </w:rPr>
+        <w:t xml:space="preserve"> Espectrograma Panorámico 18D en Ordenación Canónica Nº 1: B12 S12 (DA) · B14 S14 (PA) · B13 S13 (XA) · [D1 D2 D3 D4 (TETRA)] · S24 B24 (XR) · S23 B23 (PR) · S34 B34 (RC) · SDR BDR. La franja sombreada entre cada masa bruta (B) y su saldo relativo (S) cuantifica el desnivel de fricción térmica (Δ = B − S ≡ Φ).</w:t>
+      </w:r>
+      <w:r>
+        <w:rPr>
+          <w:rFonts w:ascii="Helvetica Neue" w:hAnsi="Helvetica Neue" w:cs="Helvetica Neue"/>
+          <w:sz w:val="27"/>
+          <w:sz-cs w:val="27"/>
+          <w:i/>
+          <w:spacing w:val="0"/>
+          <w:color w:val="64270E"/>
+        </w:rPr>
+        <w:t xml:space="preserve"/>
+      </w:r>
+    </w:p>
+    <w:p>
+      <w:pPr/>
+      <w:r>
+        <w:rPr>
+          <w:rFonts w:ascii="Helvetica Neue" w:hAnsi="Helvetica Neue" w:cs="Helvetica Neue"/>
+          <w:sz w:val="25"/>
+          <w:sz-cs w:val="25"/>
+          <w:b/>
+          <w:spacing w:val="0"/>
+          <w:color w:val="351304"/>
+        </w:rPr>
+        <w:t xml:space="preserve">Función metodológica:</w:t>
+      </w:r>
+      <w:r>
+        <w:rPr>
+          <w:rFonts w:ascii="Helvetica Neue" w:hAnsi="Helvetica Neue" w:cs="Helvetica Neue"/>
+          <w:sz w:val="25"/>
+          <w:sz-cs w:val="25"/>
+          <w:spacing w:val="0"/>
+          <w:color w:val="351304"/>
+        </w:rPr>
+        <w:t xml:space="preserve"> Proyección panorámica simultánea de las 18 dimensiones vinculares en un único continuo, integrando el cálculo de fricción térmica disipativa conforme a la Doctrina Canónica Oficial (Edición Crema Editorial).</w:t>
+      </w:r>
+      <w:r>
+        <w:rPr>
+          <w:rFonts w:ascii="Helvetica Neue" w:hAnsi="Helvetica Neue" w:cs="Helvetica Neue"/>
+          <w:sz w:val="25"/>
+          <w:sz-cs w:val="25"/>
+          <w:spacing w:val="0"/>
+          <w:color w:val="351304"/>
+        </w:rPr>
+        <w:t xml:space="preserve"/>
+      </w:r>
+    </w:p>
+    <w:p>
+      <w:pPr/>
+      <w:r>
+        <w:rPr>
+          <w:rFonts w:ascii=".SF NS" w:hAnsi=".SF NS" w:cs=".SF NS"/>
+          <w:sz w:val="24"/>
+          <w:sz-cs w:val="24"/>
+          <w:b/>
+          <w:spacing w:val="0"/>
+          <w:color w:val="13645B"/>
+        </w:rPr>
+        <w:t xml:space="preserve">GRÁFICA COMPUESTA 18D (EDICIÓN VISORD WEB / DARK NEON)</w:t>
+      </w:r>
+    </w:p>
+    <w:p>
+      <w:pPr/>
+      <w:r>
+        <w:rPr>
+          <w:rFonts w:ascii=".SF NS" w:hAnsi=".SF NS" w:cs=".SF NS"/>
+          <w:sz w:val="26"/>
+          <w:sz-cs w:val="26"/>
+          <w:b/>
+          <w:spacing w:val="0"/>
+          <w:color w:val="526078"/>
+        </w:rPr>
+        <w:t xml:space="preserve">Sección 4.4.1 y 4.4.2: Las 18 Densidades Relacionales y Desniveles de Tensión (Δ)</w:t>
+      </w:r>
+      <w:r>
+        <w:rPr>
+          <w:rFonts w:ascii=".SF NS" w:hAnsi=".SF NS" w:cs=".SF NS"/>
+          <w:sz w:val="26"/>
+          <w:sz-cs w:val="26"/>
+          <w:b/>
+          <w:spacing w:val="0"/>
+          <w:color w:val="526078"/>
+        </w:rPr>
+        <w:t xml:space="preserve"/>
+      </w:r>
+    </w:p>
+    <w:p>
+      <w:pPr/>
+      <w:r>
+        <w:rPr>
+          <w:rFonts w:ascii="Helvetica Neue" w:hAnsi="Helvetica Neue" w:cs="Helvetica Neue"/>
+          <w:sz w:val="40"/>
+          <w:sz-cs w:val="40"/>
+          <w:b/>
+          <w:spacing w:val="0"/>
+          <w:color w:val="171E2D"/>
+        </w:rPr>
+        <w:t xml:space="preserve">Gráfica Compuesta 18D. Espectrograma Panorámico en Modo Oscuro (Pantalla 2d)</w:t>
+      </w:r>
+      <w:r>
+        <w:rPr>
+          <w:rFonts w:ascii="Helvetica Neue" w:hAnsi="Helvetica Neue" w:cs="Helvetica Neue"/>
+          <w:sz w:val="40"/>
+          <w:sz-cs w:val="40"/>
+          <w:b/>
+          <w:spacing w:val="0"/>
+          <w:color w:val="171E2D"/>
+        </w:rPr>
+        <w:t xml:space="preserve"/>
+      </w:r>
+    </w:p>
+    <w:p>
+      <w:pPr>
+        <w:jc w:val="center"/>
+      </w:pPr>
+      <w:r>
+        <w:rPr>
+          <w:rFonts w:ascii="Helvetica Neue" w:hAnsi="Helvetica Neue" w:cs="Helvetica Neue"/>
+          <w:sz w:val="24"/>
+          <w:sz-cs w:val="24"/>
+          <w:spacing w:val="0"/>
+          <w:color w:val="0D121F"/>
+        </w:rPr>
+        <w:t xml:space="preserve"/>
+      </w:r>
+      <w:r>
+        <w:rPr>
+          <w:rFonts w:ascii="Helvetica Neue" w:hAnsi="Helvetica Neue" w:cs="Helvetica Neue"/>
+          <w:sz w:val="24"/>
+          <w:sz-cs w:val="24"/>
+          <w:spacing w:val="0"/>
+          <w:color w:val="0D121F"/>
+        </w:rPr>
+        <w:t xml:space="preserve"/>
+      </w:r>
+    </w:p>
+    <w:p>
+      <w:pPr>
+        <w:spacing w:after="160"/>
+      </w:pPr>
+      <w:r>
+        <w:rPr>
+          <w:rFonts w:ascii="Helvetica Neue" w:hAnsi="Helvetica Neue" w:cs="Helvetica Neue"/>
+          <w:sz w:val="27"/>
+          <w:sz-cs w:val="27"/>
+          <w:b/>
+          <w:i/>
+          <w:spacing w:val="0"/>
+          <w:color w:val="64270E"/>
+        </w:rPr>
+        <w:t xml:space="preserve">Leyenda oficial:</w:t>
+      </w:r>
+      <w:r>
+        <w:rPr>
+          <w:rFonts w:ascii="Helvetica Neue" w:hAnsi="Helvetica Neue" w:cs="Helvetica Neue"/>
+          <w:sz w:val="27"/>
+          <w:sz-cs w:val="27"/>
+          <w:i/>
+          <w:spacing w:val="0"/>
+          <w:color w:val="64270E"/>
+        </w:rPr>
+        <w:t xml:space="preserve"> Espectrograma Panorámico 18D en Modo Oscuro Institucional (#0B132B / Neón): Idéntica proyección física de alta resolución desplegada en la pantalla interactiva 2d de la Plataforma VISORD.</w:t>
+      </w:r>
+      <w:r>
+        <w:rPr>
+          <w:rFonts w:ascii="Helvetica Neue" w:hAnsi="Helvetica Neue" w:cs="Helvetica Neue"/>
+          <w:sz w:val="27"/>
+          <w:sz-cs w:val="27"/>
+          <w:i/>
+          <w:spacing w:val="0"/>
+          <w:color w:val="64270E"/>
+        </w:rPr>
+        <w:t xml:space="preserve"/>
+      </w:r>
+    </w:p>
+    <w:p>
+      <w:pPr/>
+      <w:r>
+        <w:rPr>
+          <w:rFonts w:ascii="Helvetica Neue" w:hAnsi="Helvetica Neue" w:cs="Helvetica Neue"/>
+          <w:sz w:val="25"/>
+          <w:sz-cs w:val="25"/>
+          <w:b/>
+          <w:spacing w:val="0"/>
+          <w:color w:val="351304"/>
+        </w:rPr>
+        <w:t xml:space="preserve">Función metodológica:</w:t>
+      </w:r>
+      <w:r>
+        <w:rPr>
+          <w:rFonts w:ascii="Helvetica Neue" w:hAnsi="Helvetica Neue" w:cs="Helvetica Neue"/>
+          <w:sz w:val="25"/>
+          <w:sz-cs w:val="25"/>
+          <w:spacing w:val="0"/>
+          <w:color w:val="351304"/>
+        </w:rPr>
+        <w:t xml:space="preserve"> Visualización de alto contraste para proyección en pantalla, auditorías interactivas y diagnóstico socio-termodinámico en tiempo real.</w:t>
       </w:r>
       <w:r>
         <w:rPr>

</xml_diff>

<commit_message>
fix(18D): sincronizar eliminacion de fondo negro y adopcion de 4 fondos suaves
</commit_message>
<xml_diff>
--- a/assets/TABLAS_Y_GRAFICOS_ENCADENADOS_NEXORD.docx
+++ b/assets/TABLAS_Y_GRAFICOS_ENCADENADOS_NEXORD.docx
@@ -198,7 +198,7 @@
           <w:spacing w:val="0"/>
           <w:color w:val="273143"/>
         </w:rPr>
-        <w:t xml:space="preserve"> 15 láminas de alta resolución (300 DPI)</w:t>
+        <w:t xml:space="preserve"> 16 láminas de alta resolución (300 DPI)</w:t>
       </w:r>
       <w:r>
         <w:rPr>
@@ -1068,7 +1068,7 @@
           <w:spacing w:val="0"/>
           <w:color w:val="13645B"/>
         </w:rPr>
-        <w:t xml:space="preserve">GRÁFICA COMPUESTA 18D (EDICIÓN IMPRESA / CREMA)</w:t>
+        <w:t xml:space="preserve">GRÁFICA COMPUESTA 18D</w:t>
       </w:r>
     </w:p>
     <w:p>
@@ -1107,7 +1107,7 @@
           <w:spacing w:val="0"/>
           <w:color w:val="171E2D"/>
         </w:rPr>
-        <w:t xml:space="preserve">Gráfica Compuesta 18D. Espectrograma Panorámico de la Energía Vincular (B12 S12 · B14 S14 ...)</w:t>
+        <w:t xml:space="preserve">Gráfica Compuesta 18D. Espectrograma Panorámico de la Energía Vincular (4 Macro-Áreas en Colores Suaves)</w:t>
       </w:r>
       <w:r>
         <w:rPr>
@@ -1171,7 +1171,7 @@
           <w:spacing w:val="0"/>
           <w:color w:val="64270E"/>
         </w:rPr>
-        <w:t xml:space="preserve"> Espectrograma Panorámico 18D en Ordenación Canónica Nº 1: B12 S12 (DA) · B14 S14 (PA) · B13 S13 (XA) · [D1 D2 D3 D4 (TETRA)] · S24 B24 (XR) · S23 B23 (PR) · S34 B34 (RC) · SDR BDR. La franja sombreada entre cada masa bruta (B) y su saldo relativo (S) cuantifica el desnivel de fricción térmica (Δ = B − S ≡ Φ).</w:t>
+        <w:t xml:space="preserve"> Espectrograma Panorámico 18D en Ordenación Canónica Nº 1: B12 S12 (DA) · B14 S14 (PA) · B13 S13 (XA) · [d1 d2 d3 d4] · S24 B24 (XR) · S23 B23 (PR) · S34 B34 (RC) · SDR BDR. Las 4 macro-áreas estructuran el campo en fondos suaves armonizados: 1) DA (Polo Emisor / Expectativas); 2) Núcleo Tetragrama (d1..d4); 3) RC (Polo Receptor / Hechos Fácticos); y 4) BDR-SDR (Invariantes Globales y Fricción Térmica Φ). La franja sombreada entre cada masa bruta (B) y su saldo relativo (S) cuantifica el desnivel de fricción térmica (Δ = B − S ≡ Φ).</w:t>
       </w:r>
       <w:r>
         <w:rPr>
@@ -1206,169 +1206,7 @@
           <w:spacing w:val="0"/>
           <w:color w:val="351304"/>
         </w:rPr>
-        <w:t xml:space="preserve"> Proyección panorámica simultánea de las 18 dimensiones vinculares en un único continuo, integrando el cálculo de fricción térmica disipativa conforme a la Doctrina Canónica Oficial (Edición Crema Editorial).</w:t>
-      </w:r>
-      <w:r>
-        <w:rPr>
-          <w:rFonts w:ascii="Helvetica Neue" w:hAnsi="Helvetica Neue" w:cs="Helvetica Neue"/>
-          <w:sz w:val="25"/>
-          <w:sz-cs w:val="25"/>
-          <w:spacing w:val="0"/>
-          <w:color w:val="351304"/>
-        </w:rPr>
-        <w:t xml:space="preserve"/>
-      </w:r>
-    </w:p>
-    <w:p>
-      <w:pPr/>
-      <w:r>
-        <w:rPr>
-          <w:rFonts w:ascii=".SF NS" w:hAnsi=".SF NS" w:cs=".SF NS"/>
-          <w:sz w:val="24"/>
-          <w:sz-cs w:val="24"/>
-          <w:b/>
-          <w:spacing w:val="0"/>
-          <w:color w:val="13645B"/>
-        </w:rPr>
-        <w:t xml:space="preserve">GRÁFICA COMPUESTA 18D (EDICIÓN VISORD WEB / DARK NEON)</w:t>
-      </w:r>
-    </w:p>
-    <w:p>
-      <w:pPr/>
-      <w:r>
-        <w:rPr>
-          <w:rFonts w:ascii=".SF NS" w:hAnsi=".SF NS" w:cs=".SF NS"/>
-          <w:sz w:val="26"/>
-          <w:sz-cs w:val="26"/>
-          <w:b/>
-          <w:spacing w:val="0"/>
-          <w:color w:val="526078"/>
-        </w:rPr>
-        <w:t xml:space="preserve">Sección 4.4.1 y 4.4.2: Las 18 Densidades Relacionales y Desniveles de Tensión (Δ)</w:t>
-      </w:r>
-      <w:r>
-        <w:rPr>
-          <w:rFonts w:ascii=".SF NS" w:hAnsi=".SF NS" w:cs=".SF NS"/>
-          <w:sz w:val="26"/>
-          <w:sz-cs w:val="26"/>
-          <w:b/>
-          <w:spacing w:val="0"/>
-          <w:color w:val="526078"/>
-        </w:rPr>
-        <w:t xml:space="preserve"/>
-      </w:r>
-    </w:p>
-    <w:p>
-      <w:pPr/>
-      <w:r>
-        <w:rPr>
-          <w:rFonts w:ascii="Helvetica Neue" w:hAnsi="Helvetica Neue" w:cs="Helvetica Neue"/>
-          <w:sz w:val="40"/>
-          <w:sz-cs w:val="40"/>
-          <w:b/>
-          <w:spacing w:val="0"/>
-          <w:color w:val="171E2D"/>
-        </w:rPr>
-        <w:t xml:space="preserve">Gráfica Compuesta 18D. Espectrograma Panorámico en Modo Oscuro (Pantalla 2d)</w:t>
-      </w:r>
-      <w:r>
-        <w:rPr>
-          <w:rFonts w:ascii="Helvetica Neue" w:hAnsi="Helvetica Neue" w:cs="Helvetica Neue"/>
-          <w:sz w:val="40"/>
-          <w:sz-cs w:val="40"/>
-          <w:b/>
-          <w:spacing w:val="0"/>
-          <w:color w:val="171E2D"/>
-        </w:rPr>
-        <w:t xml:space="preserve"/>
-      </w:r>
-    </w:p>
-    <w:p>
-      <w:pPr>
-        <w:jc w:val="center"/>
-      </w:pPr>
-      <w:r>
-        <w:rPr>
-          <w:rFonts w:ascii="Helvetica Neue" w:hAnsi="Helvetica Neue" w:cs="Helvetica Neue"/>
-          <w:sz w:val="24"/>
-          <w:sz-cs w:val="24"/>
-          <w:spacing w:val="0"/>
-          <w:color w:val="0D121F"/>
-        </w:rPr>
-        <w:t xml:space="preserve"/>
-      </w:r>
-      <w:r>
-        <w:rPr>
-          <w:rFonts w:ascii="Helvetica Neue" w:hAnsi="Helvetica Neue" w:cs="Helvetica Neue"/>
-          <w:sz w:val="24"/>
-          <w:sz-cs w:val="24"/>
-          <w:spacing w:val="0"/>
-          <w:color w:val="0D121F"/>
-        </w:rPr>
-        <w:t xml:space="preserve"/>
-      </w:r>
-    </w:p>
-    <w:p>
-      <w:pPr>
-        <w:spacing w:after="160"/>
-      </w:pPr>
-      <w:r>
-        <w:rPr>
-          <w:rFonts w:ascii="Helvetica Neue" w:hAnsi="Helvetica Neue" w:cs="Helvetica Neue"/>
-          <w:sz w:val="27"/>
-          <w:sz-cs w:val="27"/>
-          <w:b/>
-          <w:i/>
-          <w:spacing w:val="0"/>
-          <w:color w:val="64270E"/>
-        </w:rPr>
-        <w:t xml:space="preserve">Leyenda oficial:</w:t>
-      </w:r>
-      <w:r>
-        <w:rPr>
-          <w:rFonts w:ascii="Helvetica Neue" w:hAnsi="Helvetica Neue" w:cs="Helvetica Neue"/>
-          <w:sz w:val="27"/>
-          <w:sz-cs w:val="27"/>
-          <w:i/>
-          <w:spacing w:val="0"/>
-          <w:color w:val="64270E"/>
-        </w:rPr>
-        <w:t xml:space="preserve"> Espectrograma Panorámico 18D en Modo Oscuro Institucional (#0B132B / Neón): Idéntica proyección física de alta resolución desplegada en la pantalla interactiva 2d de la Plataforma VISORD.</w:t>
-      </w:r>
-      <w:r>
-        <w:rPr>
-          <w:rFonts w:ascii="Helvetica Neue" w:hAnsi="Helvetica Neue" w:cs="Helvetica Neue"/>
-          <w:sz w:val="27"/>
-          <w:sz-cs w:val="27"/>
-          <w:i/>
-          <w:spacing w:val="0"/>
-          <w:color w:val="64270E"/>
-        </w:rPr>
-        <w:t xml:space="preserve"/>
-      </w:r>
-    </w:p>
-    <w:p>
-      <w:pPr/>
-      <w:r>
-        <w:rPr>
-          <w:rFonts w:ascii="Helvetica Neue" w:hAnsi="Helvetica Neue" w:cs="Helvetica Neue"/>
-          <w:sz w:val="25"/>
-          <w:sz-cs w:val="25"/>
-          <w:b/>
-          <w:spacing w:val="0"/>
-          <w:color w:val="351304"/>
-        </w:rPr>
-        <w:t xml:space="preserve">Función metodológica:</w:t>
-      </w:r>
-      <w:r>
-        <w:rPr>
-          <w:rFonts w:ascii="Helvetica Neue" w:hAnsi="Helvetica Neue" w:cs="Helvetica Neue"/>
-          <w:sz w:val="25"/>
-          <w:sz-cs w:val="25"/>
-          <w:spacing w:val="0"/>
-          <w:color w:val="351304"/>
-        </w:rPr>
-        <w:t xml:space="preserve"> Visualización de alto contraste para proyección en pantalla, auditorías interactivas y diagnóstico socio-termodinámico en tiempo real.</w:t>
+        <w:t xml:space="preserve"> Proyección panorámica simultánea de las 18 dimensiones vinculares en un único continuo, integrando el cálculo de fricción térmica disipativa estructurada en 4 macro-áreas con fondos pastel armonizados.</w:t>
       </w:r>
       <w:r>
         <w:rPr>

</xml_diff>

<commit_message>
feat(18d): actualizar assets del espectrograma 18d suave y catalogo encadenado
</commit_message>
<xml_diff>
--- a/assets/TABLAS_Y_GRAFICOS_ENCADENADOS_NEXORD.docx
+++ b/assets/TABLAS_Y_GRAFICOS_ENCADENADOS_NEXORD.docx
@@ -198,7 +198,7 @@
           <w:spacing w:val="0"/>
           <w:color w:val="273143"/>
         </w:rPr>
-        <w:t xml:space="preserve"> 16 láminas de alta resolución (300 DPI)</w:t>
+        <w:t xml:space="preserve"> 20 láminas de alta resolución (300 DPI)</w:t>
       </w:r>
       <w:r>
         <w:rPr>
@@ -396,7 +396,7 @@
           <w:spacing w:val="0"/>
           <w:color w:val="351304"/>
         </w:rPr>
-        <w:t xml:space="preserve"> Identificador visual inviolable presente en toda la documentación, informes clínicos y entornos interactivos VISORD.</w:t>
+        <w:t xml:space="preserve"> Identificador visual presente en toda la documentación, informes y entornos interactivos VISORD.</w:t>
       </w:r>
       <w:r>
         <w:rPr>
@@ -596,32 +596,32 @@
           <w:spacing w:val="0"/>
           <w:color w:val="526078"/>
         </w:rPr>
-        <w:t xml:space="preserve">Sección 2.1: Orden sin empates y Dualidad Matricial A(i, k)=j vs. B(i, j)=k</w:t>
-      </w:r>
-      <w:r>
-        <w:rPr>
-          <w:rFonts w:ascii=".SF NS" w:hAnsi=".SF NS" w:cs=".SF NS"/>
-          <w:sz w:val="26"/>
-          <w:sz-cs w:val="26"/>
-          <w:b/>
-          <w:spacing w:val="0"/>
-          <w:color w:val="526078"/>
-        </w:rPr>
-        <w:t xml:space="preserve"/>
-      </w:r>
-    </w:p>
-    <w:p>
-      <w:pPr/>
-      <w:r>
-        <w:rPr>
-          <w:rFonts w:ascii="Helvetica Neue" w:hAnsi="Helvetica Neue" w:cs="Helvetica Neue"/>
-          <w:sz w:val="40"/>
-          <w:sz-cs w:val="40"/>
-          <w:b/>
-          <w:spacing w:val="0"/>
-          <w:color w:val="171E2D"/>
-        </w:rPr>
-        <w:t xml:space="preserve">Ingestión Comparativa: Sociomatriz Moreno Tradicional vs Formato ORBIT (N = 6)</w:t>
+        <w:t xml:space="preserve">Sección 2.1: Ingestión Factual y Matrices A(i, k)=j vs. B(i, j)=k</w:t>
+      </w:r>
+      <w:r>
+        <w:rPr>
+          <w:rFonts w:ascii=".SF NS" w:hAnsi=".SF NS" w:cs=".SF NS"/>
+          <w:sz w:val="26"/>
+          <w:sz-cs w:val="26"/>
+          <w:b/>
+          <w:spacing w:val="0"/>
+          <w:color w:val="526078"/>
+        </w:rPr>
+        <w:t xml:space="preserve"/>
+      </w:r>
+    </w:p>
+    <w:p>
+      <w:pPr/>
+      <w:r>
+        <w:rPr>
+          <w:rFonts w:ascii="Helvetica Neue" w:hAnsi="Helvetica Neue" w:cs="Helvetica Neue"/>
+          <w:sz w:val="40"/>
+          <w:sz-cs w:val="40"/>
+          <w:b/>
+          <w:spacing w:val="0"/>
+          <w:color w:val="171E2D"/>
+        </w:rPr>
+        <w:t xml:space="preserve">Cuadro 1. Transposición Bidireccional Moreno ⟷ Breve (N = 6)</w:t>
       </w:r>
       <w:r>
         <w:rPr>
@@ -685,7 +685,7 @@
           <w:spacing w:val="0"/>
           <w:color w:val="64270E"/>
         </w:rPr>
-        <w:t xml:space="preserve"> Estructura comparativa de entrada de datos: arriba, cuestionario clásico de Moreno restringido a elecciones/rechazos discretos; abajo, la Sociomatriz ORBIT con ordenación preferencial exhaustiva sin empates que satisface invariablemente la ley de conservación de la suma ordinal.</w:t>
+        <w:t xml:space="preserve"> Estructura comparativa y algoritmo de transposición bidireccional entre la sociomatriz clásica de Moreno y el formato ordinal BREVE sin empates (N = 6). Arriba: Ingestión Moreno original y su transposición a BREVE. Abajo: Ingestión BREVE original y su transposición canónica a Moreno.</w:t>
       </w:r>
       <w:r>
         <w:rPr>
@@ -720,7 +720,7 @@
           <w:spacing w:val="0"/>
           <w:color w:val="351304"/>
         </w:rPr>
-        <w:t xml:space="preserve"> La Sociomatriz ORBIT A(i, k)=j y su dual distributiva B(i, j)=k preservan la totalidad de la información vincular sin truncamientos arbitrarios.</w:t>
+        <w:t xml:space="preserve"> Garantiza la preservación factual de los datos y satisface invariablemente la ley de conservación de la suma ordinal.</w:t>
       </w:r>
       <w:r>
         <w:rPr>
@@ -744,46 +744,46 @@
           <w:spacing w:val="0"/>
           <w:color w:val="13645B"/>
         </w:rPr>
-        <w:t xml:space="preserve">ESQUEMA CONCEPTUAL</w:t>
-      </w:r>
-    </w:p>
-    <w:p>
-      <w:pPr/>
-      <w:r>
-        <w:rPr>
-          <w:rFonts w:ascii=".SF NS" w:hAnsi=".SF NS" w:cs=".SF NS"/>
-          <w:sz w:val="26"/>
-          <w:sz-cs w:val="26"/>
-          <w:b/>
-          <w:spacing w:val="0"/>
-          <w:color w:val="526078"/>
-        </w:rPr>
-        <w:t xml:space="preserve">Sección 2.1 y Sección 4.2: El Tetragrama Diádico y la Retícula Q81</w:t>
-      </w:r>
-      <w:r>
-        <w:rPr>
-          <w:rFonts w:ascii=".SF NS" w:hAnsi=".SF NS" w:cs=".SF NS"/>
-          <w:sz w:val="26"/>
-          <w:sz-cs w:val="26"/>
-          <w:b/>
-          <w:spacing w:val="0"/>
-          <w:color w:val="526078"/>
-        </w:rPr>
-        <w:t xml:space="preserve"/>
-      </w:r>
-    </w:p>
-    <w:p>
-      <w:pPr/>
-      <w:r>
-        <w:rPr>
-          <w:rFonts w:ascii="Helvetica Neue" w:hAnsi="Helvetica Neue" w:cs="Helvetica Neue"/>
-          <w:sz w:val="40"/>
-          <w:sz-cs w:val="40"/>
-          <w:b/>
-          <w:spacing w:val="0"/>
-          <w:color w:val="171E2D"/>
-        </w:rPr>
-        <w:t xml:space="preserve">Estructura del Tetragrama Diádico SMIb / SMIa y Micro-Interacción (i, j)</w:t>
+        <w:t xml:space="preserve">CUADRO SINTÁCTICO</w:t>
+      </w:r>
+    </w:p>
+    <w:p>
+      <w:pPr/>
+      <w:r>
+        <w:rPr>
+          <w:rFonts w:ascii=".SF NS" w:hAnsi=".SF NS" w:cs=".SF NS"/>
+          <w:sz w:val="26"/>
+          <w:sz-cs w:val="26"/>
+          <w:b/>
+          <w:spacing w:val="0"/>
+          <w:color w:val="526078"/>
+        </w:rPr>
+        <w:t xml:space="preserve">Sección 2.2 y 4.2: Alfabeto Simbólico y Tetragrama de Intercambio (i, j)</w:t>
+      </w:r>
+      <w:r>
+        <w:rPr>
+          <w:rFonts w:ascii=".SF NS" w:hAnsi=".SF NS" w:cs=".SF NS"/>
+          <w:sz w:val="26"/>
+          <w:sz-cs w:val="26"/>
+          <w:b/>
+          <w:spacing w:val="0"/>
+          <w:color w:val="526078"/>
+        </w:rPr>
+        <w:t xml:space="preserve"/>
+      </w:r>
+    </w:p>
+    <w:p>
+      <w:pPr/>
+      <w:r>
+        <w:rPr>
+          <w:rFonts w:ascii="Helvetica Neue" w:hAnsi="Helvetica Neue" w:cs="Helvetica Neue"/>
+          <w:sz w:val="40"/>
+          <w:sz-cs w:val="40"/>
+          <w:b/>
+          <w:spacing w:val="0"/>
+          <w:color w:val="171E2D"/>
+        </w:rPr>
+        <w:t xml:space="preserve">Cuadro 2a. Sintaxis Canónica SMIa y Formación de Tetragramas Diádicos</w:t>
       </w:r>
       <w:r>
         <w:rPr>
@@ -847,7 +847,7 @@
           <w:spacing w:val="0"/>
           <w:color w:val="64270E"/>
         </w:rPr>
-        <w:t xml:space="preserve"> Descomposición formal de las 4 posiciones del tetragrama en la celda (i, j): A1 = p_DA (expectativa del emisor), A2 = DA (preferencia efectiva emitida), A3 = RECIBE (preferencia efectiva recibida), A4 = p_RECIBE (expectativa presumida en el partner).</w:t>
+        <w:t xml:space="preserve"> Descomposición formal de las 4 posiciones del tetragrama en la celda (i, j): A1 = p_DA (expectativa del emisor), A2 = DA (preferencia efectiva emitida), A3 = RECIBE (preferencia efectiva recibida), A4 = p_RECIBE (expectativa presumida en el partner), con codificación binaria/ASCII correspondiente.</w:t>
       </w:r>
       <w:r>
         <w:rPr>
@@ -882,7 +882,7 @@
           <w:spacing w:val="0"/>
           <w:color w:val="351304"/>
         </w:rPr>
-        <w:t xml:space="preserve"> Canón analítico inviolable del cálculo relacional. Permite clasificar cada vínculo en una de las 81 figuras diádicas elementales (Q81).</w:t>
+        <w:t xml:space="preserve"> Estructura canónica del cálculo relacional. Permite clasificar cada vínculo en una de las 81 figuras diádicas elementales (Q81).</w:t>
       </w:r>
       <w:r>
         <w:rPr>
@@ -906,6 +906,654 @@
           <w:spacing w:val="0"/>
           <w:color w:val="13645B"/>
         </w:rPr>
+        <w:t xml:space="preserve">MATRICES DIÁDICAS</w:t>
+      </w:r>
+    </w:p>
+    <w:p>
+      <w:pPr/>
+      <w:r>
+        <w:rPr>
+          <w:rFonts w:ascii=".SF NS" w:hAnsi=".SF NS" w:cs=".SF NS"/>
+          <w:sz w:val="26"/>
+          <w:sz-cs w:val="26"/>
+          <w:b/>
+          <w:spacing w:val="0"/>
+          <w:color w:val="526078"/>
+        </w:rPr>
+        <w:t xml:space="preserve">Sección 2.2: Dualidad Simbólica/Numérica SMIa y SMIb</w:t>
+      </w:r>
+      <w:r>
+        <w:rPr>
+          <w:rFonts w:ascii=".SF NS" w:hAnsi=".SF NS" w:cs=".SF NS"/>
+          <w:sz w:val="26"/>
+          <w:sz-cs w:val="26"/>
+          <w:b/>
+          <w:spacing w:val="0"/>
+          <w:color w:val="526078"/>
+        </w:rPr>
+        <w:t xml:space="preserve"/>
+      </w:r>
+    </w:p>
+    <w:p>
+      <w:pPr/>
+      <w:r>
+        <w:rPr>
+          <w:rFonts w:ascii="Helvetica Neue" w:hAnsi="Helvetica Neue" w:cs="Helvetica Neue"/>
+          <w:sz w:val="40"/>
+          <w:sz-cs w:val="40"/>
+          <w:b/>
+          <w:spacing w:val="0"/>
+          <w:color w:val="171E2D"/>
+        </w:rPr>
+        <w:t xml:space="preserve">Cuadro 2b. Matrices Diádicas Paralelas SMIa (Simbólica) y SMIb (Alfanumérica) (N = 6)</w:t>
+      </w:r>
+      <w:r>
+        <w:rPr>
+          <w:rFonts w:ascii="Helvetica Neue" w:hAnsi="Helvetica Neue" w:cs="Helvetica Neue"/>
+          <w:sz w:val="40"/>
+          <w:sz-cs w:val="40"/>
+          <w:b/>
+          <w:spacing w:val="0"/>
+          <w:color w:val="171E2D"/>
+        </w:rPr>
+        <w:t xml:space="preserve"/>
+      </w:r>
+    </w:p>
+    <w:p>
+      <w:pPr>
+        <w:jc w:val="center"/>
+      </w:pPr>
+      <w:r>
+        <w:rPr>
+          <w:rFonts w:ascii="Helvetica Neue" w:hAnsi="Helvetica Neue" w:cs="Helvetica Neue"/>
+          <w:sz w:val="24"/>
+          <w:sz-cs w:val="24"/>
+          <w:spacing w:val="0"/>
+          <w:color w:val="0D121F"/>
+        </w:rPr>
+        <w:t xml:space="preserve"/>
+      </w:r>
+      <w:r>
+        <w:rPr>
+          <w:rFonts w:ascii="Helvetica Neue" w:hAnsi="Helvetica Neue" w:cs="Helvetica Neue"/>
+          <w:sz w:val="24"/>
+          <w:sz-cs w:val="24"/>
+          <w:spacing w:val="0"/>
+          <w:color w:val="0D121F"/>
+        </w:rPr>
+        <w:t xml:space="preserve"/>
+      </w:r>
+    </w:p>
+    <w:p>
+      <w:pPr>
+        <w:spacing w:after="160"/>
+      </w:pPr>
+      <w:r>
+        <w:rPr>
+          <w:rFonts w:ascii="Helvetica Neue" w:hAnsi="Helvetica Neue" w:cs="Helvetica Neue"/>
+          <w:sz w:val="27"/>
+          <w:sz-cs w:val="27"/>
+          <w:b/>
+          <w:i/>
+          <w:spacing w:val="0"/>
+          <w:color w:val="64270E"/>
+        </w:rPr>
+        <w:t xml:space="preserve">Leyenda oficial:</w:t>
+      </w:r>
+      <w:r>
+        <w:rPr>
+          <w:rFonts w:ascii="Helvetica Neue" w:hAnsi="Helvetica Neue" w:cs="Helvetica Neue"/>
+          <w:sz w:val="27"/>
+          <w:sz-cs w:val="27"/>
+          <w:i/>
+          <w:spacing w:val="0"/>
+          <w:color w:val="64270E"/>
+        </w:rPr>
+        <w:t xml:space="preserve"> Matrices diádicas paralelas de un grupo de N = 6 sujetos. Izquierda: Matriz SMIa con tetragramas simbólicos de interacción. Derecha: Matriz SMIb con tetragramas hexadecimales equivalentes para procesamiento vectorial directo.</w:t>
+      </w:r>
+      <w:r>
+        <w:rPr>
+          <w:rFonts w:ascii="Helvetica Neue" w:hAnsi="Helvetica Neue" w:cs="Helvetica Neue"/>
+          <w:sz w:val="27"/>
+          <w:sz-cs w:val="27"/>
+          <w:i/>
+          <w:spacing w:val="0"/>
+          <w:color w:val="64270E"/>
+        </w:rPr>
+        <w:t xml:space="preserve"/>
+      </w:r>
+    </w:p>
+    <w:p>
+      <w:pPr/>
+      <w:r>
+        <w:rPr>
+          <w:rFonts w:ascii="Helvetica Neue" w:hAnsi="Helvetica Neue" w:cs="Helvetica Neue"/>
+          <w:sz w:val="25"/>
+          <w:sz-cs w:val="25"/>
+          <w:b/>
+          <w:spacing w:val="0"/>
+          <w:color w:val="351304"/>
+        </w:rPr>
+        <w:t xml:space="preserve">Función metodológica:</w:t>
+      </w:r>
+      <w:r>
+        <w:rPr>
+          <w:rFonts w:ascii="Helvetica Neue" w:hAnsi="Helvetica Neue" w:cs="Helvetica Neue"/>
+          <w:sz w:val="25"/>
+          <w:sz-cs w:val="25"/>
+          <w:spacing w:val="0"/>
+          <w:color w:val="351304"/>
+        </w:rPr>
+        <w:t xml:space="preserve"> Dualidad operacional que permite la verificación clínica inmediata (SMIa) y el cálculo matricial de alta velocidad (SMIb).</w:t>
+      </w:r>
+      <w:r>
+        <w:rPr>
+          <w:rFonts w:ascii="Helvetica Neue" w:hAnsi="Helvetica Neue" w:cs="Helvetica Neue"/>
+          <w:sz w:val="25"/>
+          <w:sz-cs w:val="25"/>
+          <w:spacing w:val="0"/>
+          <w:color w:val="351304"/>
+        </w:rPr>
+        <w:t xml:space="preserve"/>
+      </w:r>
+    </w:p>
+    <w:p>
+      <w:pPr/>
+      <w:r>
+        <w:rPr>
+          <w:rFonts w:ascii=".SF NS" w:hAnsi=".SF NS" w:cs=".SF NS"/>
+          <w:sz w:val="24"/>
+          <w:sz-cs w:val="24"/>
+          <w:b/>
+          <w:spacing w:val="0"/>
+          <w:color w:val="13645B"/>
+        </w:rPr>
+        <w:t xml:space="preserve">MATRIZ DE ESCALA CARDINAL (ANTES DE DENSIDAD)</w:t>
+      </w:r>
+    </w:p>
+    <w:p>
+      <w:pPr/>
+      <w:r>
+        <w:rPr>
+          <w:rFonts w:ascii=".SF NS" w:hAnsi=".SF NS" w:cs=".SF NS"/>
+          <w:sz w:val="26"/>
+          <w:sz-cs w:val="26"/>
+          <w:b/>
+          <w:spacing w:val="0"/>
+          <w:color w:val="526078"/>
+        </w:rPr>
+        <w:t xml:space="preserve">Sección 4.2: La Retícula Q81 y el Factor F = Q81:num / 41 (Base de la Densidad Relacional)</w:t>
+      </w:r>
+      <w:r>
+        <w:rPr>
+          <w:rFonts w:ascii=".SF NS" w:hAnsi=".SF NS" w:cs=".SF NS"/>
+          <w:sz w:val="26"/>
+          <w:sz-cs w:val="26"/>
+          <w:b/>
+          <w:spacing w:val="0"/>
+          <w:color w:val="526078"/>
+        </w:rPr>
+        <w:t xml:space="preserve"/>
+      </w:r>
+    </w:p>
+    <w:p>
+      <w:pPr/>
+      <w:r>
+        <w:rPr>
+          <w:rFonts w:ascii="Helvetica Neue" w:hAnsi="Helvetica Neue" w:cs="Helvetica Neue"/>
+          <w:sz w:val="40"/>
+          <w:sz-cs w:val="40"/>
+          <w:b/>
+          <w:spacing w:val="0"/>
+          <w:color w:val="171E2D"/>
+        </w:rPr>
+        <w:t xml:space="preserve">Cuadro 2c. Numeralización de Figuras Relacionales Q81(9,9): De 81 a 1 con Centro en 41</w:t>
+      </w:r>
+      <w:r>
+        <w:rPr>
+          <w:rFonts w:ascii="Helvetica Neue" w:hAnsi="Helvetica Neue" w:cs="Helvetica Neue"/>
+          <w:sz w:val="40"/>
+          <w:sz-cs w:val="40"/>
+          <w:b/>
+          <w:spacing w:val="0"/>
+          <w:color w:val="171E2D"/>
+        </w:rPr>
+        <w:t xml:space="preserve"/>
+      </w:r>
+    </w:p>
+    <w:p>
+      <w:pPr>
+        <w:jc w:val="center"/>
+      </w:pPr>
+      <w:r>
+        <w:rPr>
+          <w:rFonts w:ascii="Helvetica Neue" w:hAnsi="Helvetica Neue" w:cs="Helvetica Neue"/>
+          <w:sz w:val="24"/>
+          <w:sz-cs w:val="24"/>
+          <w:spacing w:val="0"/>
+          <w:color w:val="0D121F"/>
+        </w:rPr>
+        <w:t xml:space="preserve"/>
+      </w:r>
+      <w:r>
+        <w:rPr>
+          <w:rFonts w:ascii="Helvetica Neue" w:hAnsi="Helvetica Neue" w:cs="Helvetica Neue"/>
+          <w:sz w:val="24"/>
+          <w:sz-cs w:val="24"/>
+          <w:spacing w:val="0"/>
+          <w:color w:val="0D121F"/>
+        </w:rPr>
+        <w:t xml:space="preserve"/>
+      </w:r>
+    </w:p>
+    <w:p>
+      <w:pPr>
+        <w:spacing w:after="160"/>
+      </w:pPr>
+      <w:r>
+        <w:rPr>
+          <w:rFonts w:ascii="Helvetica Neue" w:hAnsi="Helvetica Neue" w:cs="Helvetica Neue"/>
+          <w:sz w:val="27"/>
+          <w:sz-cs w:val="27"/>
+          <w:b/>
+          <w:i/>
+          <w:spacing w:val="0"/>
+          <w:color w:val="64270E"/>
+        </w:rPr>
+        <w:t xml:space="preserve">Leyenda oficial:</w:t>
+      </w:r>
+      <w:r>
+        <w:rPr>
+          <w:rFonts w:ascii="Helvetica Neue" w:hAnsi="Helvetica Neue" w:cs="Helvetica Neue"/>
+          <w:sz w:val="27"/>
+          <w:sz-cs w:val="27"/>
+          <w:i/>
+          <w:spacing w:val="0"/>
+          <w:color w:val="64270E"/>
+        </w:rPr>
+        <w:t xml:space="preserve"> Matriz de numeralización cardinal Q81(9,9) para las 81 figuras sociométricas elementales: escala descendente desde 81 (, resonancia pura positiva) hasta 1 ([Rr], rechazo mutuo bilateral), con centro neutro en 41 (¡¿?!, indiferencia basal). Este valor cardinal define directamente el factor F = Q81:num / 41 en la ecuación de densidad.</w:t>
+      </w:r>
+      <w:r>
+        <w:rPr>
+          <w:rFonts w:ascii="Helvetica Neue" w:hAnsi="Helvetica Neue" w:cs="Helvetica Neue"/>
+          <w:sz w:val="27"/>
+          <w:sz-cs w:val="27"/>
+          <w:i/>
+          <w:spacing w:val="0"/>
+          <w:color w:val="64270E"/>
+        </w:rPr>
+        <w:t xml:space="preserve"/>
+      </w:r>
+    </w:p>
+    <w:p>
+      <w:pPr/>
+      <w:r>
+        <w:rPr>
+          <w:rFonts w:ascii="Helvetica Neue" w:hAnsi="Helvetica Neue" w:cs="Helvetica Neue"/>
+          <w:sz w:val="25"/>
+          <w:sz-cs w:val="25"/>
+          <w:b/>
+          <w:spacing w:val="0"/>
+          <w:color w:val="351304"/>
+        </w:rPr>
+        <w:t xml:space="preserve">Función metodológica:</w:t>
+      </w:r>
+      <w:r>
+        <w:rPr>
+          <w:rFonts w:ascii="Helvetica Neue" w:hAnsi="Helvetica Neue" w:cs="Helvetica Neue"/>
+          <w:sz w:val="25"/>
+          <w:sz-cs w:val="25"/>
+          <w:spacing w:val="0"/>
+          <w:color w:val="351304"/>
+        </w:rPr>
+        <w:t xml:space="preserve"> Paso previo indispensable al cálculo de densidades: transforma la topología cualitativa de 81 estados diádicos en un gradiente continuo riguroso.</w:t>
+      </w:r>
+      <w:r>
+        <w:rPr>
+          <w:rFonts w:ascii="Helvetica Neue" w:hAnsi="Helvetica Neue" w:cs="Helvetica Neue"/>
+          <w:sz w:val="25"/>
+          <w:sz-cs w:val="25"/>
+          <w:spacing w:val="0"/>
+          <w:color w:val="351304"/>
+        </w:rPr>
+        <w:t xml:space="preserve"/>
+      </w:r>
+    </w:p>
+    <w:p>
+      <w:pPr/>
+      <w:r>
+        <w:rPr>
+          <w:rFonts w:ascii=".SF NS" w:hAnsi=".SF NS" w:cs=".SF NS"/>
+          <w:sz w:val="24"/>
+          <w:sz-cs w:val="24"/>
+          <w:b/>
+          <w:spacing w:val="0"/>
+          <w:color w:val="13645B"/>
+        </w:rPr>
+        <w:t xml:space="preserve">ECUACIÓN DE CAMPO</w:t>
+      </w:r>
+    </w:p>
+    <w:p>
+      <w:pPr/>
+      <w:r>
+        <w:rPr>
+          <w:rFonts w:ascii=".SF NS" w:hAnsi=".SF NS" w:cs=".SF NS"/>
+          <w:sz w:val="26"/>
+          <w:sz-cs w:val="26"/>
+          <w:b/>
+          <w:spacing w:val="0"/>
+          <w:color w:val="526078"/>
+        </w:rPr>
+        <w:t xml:space="preserve">Sección 4.4.1: Función Continua de Densidad Relacional Ponderada</w:t>
+      </w:r>
+      <w:r>
+        <w:rPr>
+          <w:rFonts w:ascii=".SF NS" w:hAnsi=".SF NS" w:cs=".SF NS"/>
+          <w:sz w:val="26"/>
+          <w:sz-cs w:val="26"/>
+          <w:b/>
+          <w:spacing w:val="0"/>
+          <w:color w:val="526078"/>
+        </w:rPr>
+        <w:t xml:space="preserve"/>
+      </w:r>
+    </w:p>
+    <w:p>
+      <w:pPr/>
+      <w:r>
+        <w:rPr>
+          <w:rFonts w:ascii="Helvetica Neue" w:hAnsi="Helvetica Neue" w:cs="Helvetica Neue"/>
+          <w:sz w:val="40"/>
+          <w:sz-cs w:val="40"/>
+          <w:b/>
+          <w:spacing w:val="0"/>
+          <w:color w:val="171E2D"/>
+        </w:rPr>
+        <w:t xml:space="preserve">Tabla 3b. Ecuación y Moduladores de la Densidad Relacional: W · M · F · R · P</w:t>
+      </w:r>
+      <w:r>
+        <w:rPr>
+          <w:rFonts w:ascii="Helvetica Neue" w:hAnsi="Helvetica Neue" w:cs="Helvetica Neue"/>
+          <w:sz w:val="40"/>
+          <w:sz-cs w:val="40"/>
+          <w:b/>
+          <w:spacing w:val="0"/>
+          <w:color w:val="171E2D"/>
+        </w:rPr>
+        <w:t xml:space="preserve"/>
+      </w:r>
+    </w:p>
+    <w:p>
+      <w:pPr>
+        <w:jc w:val="center"/>
+      </w:pPr>
+      <w:r>
+        <w:rPr>
+          <w:rFonts w:ascii="Helvetica Neue" w:hAnsi="Helvetica Neue" w:cs="Helvetica Neue"/>
+          <w:sz w:val="24"/>
+          <w:sz-cs w:val="24"/>
+          <w:spacing w:val="0"/>
+          <w:color w:val="0D121F"/>
+        </w:rPr>
+        <w:t xml:space="preserve"/>
+      </w:r>
+      <w:r>
+        <w:rPr>
+          <w:rFonts w:ascii="Helvetica Neue" w:hAnsi="Helvetica Neue" w:cs="Helvetica Neue"/>
+          <w:sz w:val="24"/>
+          <w:sz-cs w:val="24"/>
+          <w:spacing w:val="0"/>
+          <w:color w:val="0D121F"/>
+        </w:rPr>
+        <w:t xml:space="preserve"/>
+      </w:r>
+    </w:p>
+    <w:p>
+      <w:pPr>
+        <w:spacing w:after="160"/>
+      </w:pPr>
+      <w:r>
+        <w:rPr>
+          <w:rFonts w:ascii="Helvetica Neue" w:hAnsi="Helvetica Neue" w:cs="Helvetica Neue"/>
+          <w:sz w:val="27"/>
+          <w:sz-cs w:val="27"/>
+          <w:b/>
+          <w:i/>
+          <w:spacing w:val="0"/>
+          <w:color w:val="64270E"/>
+        </w:rPr>
+        <w:t xml:space="preserve">Leyenda oficial:</w:t>
+      </w:r>
+      <w:r>
+        <w:rPr>
+          <w:rFonts w:ascii="Helvetica Neue" w:hAnsi="Helvetica Neue" w:cs="Helvetica Neue"/>
+          <w:sz w:val="27"/>
+          <w:sz-cs w:val="27"/>
+          <w:i/>
+          <w:spacing w:val="0"/>
+          <w:color w:val="64270E"/>
+        </w:rPr>
+        <w:t xml:space="preserve"> Ecuación maestra de la Densidad Relacional = W · M · F · R · P. Columna 1 (W): Ponderación vectorial posicional (W1 a W4). Columna 2 (M): Moduladores diádicos de reciprocidad, clarividencia y esfuerzo. Columna 3: Factor cardinal F = Q81:num / 41, atenuación de rango R = 1/x^k, y factor de polarización P.</w:t>
+      </w:r>
+      <w:r>
+        <w:rPr>
+          <w:rFonts w:ascii="Helvetica Neue" w:hAnsi="Helvetica Neue" w:cs="Helvetica Neue"/>
+          <w:sz w:val="27"/>
+          <w:sz-cs w:val="27"/>
+          <w:i/>
+          <w:spacing w:val="0"/>
+          <w:color w:val="64270E"/>
+        </w:rPr>
+        <w:t xml:space="preserve"/>
+      </w:r>
+    </w:p>
+    <w:p>
+      <w:pPr/>
+      <w:r>
+        <w:rPr>
+          <w:rFonts w:ascii="Helvetica Neue" w:hAnsi="Helvetica Neue" w:cs="Helvetica Neue"/>
+          <w:sz w:val="25"/>
+          <w:sz-cs w:val="25"/>
+          <w:b/>
+          <w:spacing w:val="0"/>
+          <w:color w:val="351304"/>
+        </w:rPr>
+        <w:t xml:space="preserve">Función metodológica:</w:t>
+      </w:r>
+      <w:r>
+        <w:rPr>
+          <w:rFonts w:ascii="Helvetica Neue" w:hAnsi="Helvetica Neue" w:cs="Helvetica Neue"/>
+          <w:sz w:val="25"/>
+          <w:sz-cs w:val="25"/>
+          <w:spacing w:val="0"/>
+          <w:color w:val="351304"/>
+        </w:rPr>
+        <w:t xml:space="preserve"> Función de campo continuo que transforma los registros ordinales discretos en un potencial electrostático/termodinámico riguroso.</w:t>
+      </w:r>
+      <w:r>
+        <w:rPr>
+          <w:rFonts w:ascii="Helvetica Neue" w:hAnsi="Helvetica Neue" w:cs="Helvetica Neue"/>
+          <w:sz w:val="25"/>
+          <w:sz-cs w:val="25"/>
+          <w:spacing w:val="0"/>
+          <w:color w:val="351304"/>
+        </w:rPr>
+        <w:t xml:space="preserve"/>
+      </w:r>
+    </w:p>
+    <w:p>
+      <w:pPr/>
+      <w:r>
+        <w:rPr>
+          <w:rFonts w:ascii=".SF NS" w:hAnsi=".SF NS" w:cs=".SF NS"/>
+          <w:sz w:val="24"/>
+          <w:sz-cs w:val="24"/>
+          <w:b/>
+          <w:spacing w:val="0"/>
+          <w:color w:val="13645B"/>
+        </w:rPr>
+        <w:t xml:space="preserve">ESTRUCTURA DE DENSIDADES</w:t>
+      </w:r>
+    </w:p>
+    <w:p>
+      <w:pPr/>
+      <w:r>
+        <w:rPr>
+          <w:rFonts w:ascii=".SF NS" w:hAnsi=".SF NS" w:cs=".SF NS"/>
+          <w:sz w:val="26"/>
+          <w:sz-cs w:val="26"/>
+          <w:b/>
+          <w:spacing w:val="0"/>
+          <w:color w:val="526078"/>
+        </w:rPr>
+        <w:t xml:space="preserve">Sección 4.4.2: Los 3 Prismas Duales (Operativo, Ontológico, Dialéctico) e Invariantes</w:t>
+      </w:r>
+      <w:r>
+        <w:rPr>
+          <w:rFonts w:ascii=".SF NS" w:hAnsi=".SF NS" w:cs=".SF NS"/>
+          <w:sz w:val="26"/>
+          <w:sz-cs w:val="26"/>
+          <w:b/>
+          <w:spacing w:val="0"/>
+          <w:color w:val="526078"/>
+        </w:rPr>
+        <w:t xml:space="preserve"/>
+      </w:r>
+    </w:p>
+    <w:p>
+      <w:pPr/>
+      <w:r>
+        <w:rPr>
+          <w:rFonts w:ascii="Helvetica Neue" w:hAnsi="Helvetica Neue" w:cs="Helvetica Neue"/>
+          <w:sz w:val="40"/>
+          <w:sz-cs w:val="40"/>
+          <w:b/>
+          <w:spacing w:val="0"/>
+          <w:color w:val="171E2D"/>
+        </w:rPr>
+        <w:t xml:space="preserve">Tabla 3c. Arquitectura de las 18 Densidades Relacionales y los 3 Prismas Duales</w:t>
+      </w:r>
+      <w:r>
+        <w:rPr>
+          <w:rFonts w:ascii="Helvetica Neue" w:hAnsi="Helvetica Neue" w:cs="Helvetica Neue"/>
+          <w:sz w:val="40"/>
+          <w:sz-cs w:val="40"/>
+          <w:b/>
+          <w:spacing w:val="0"/>
+          <w:color w:val="171E2D"/>
+        </w:rPr>
+        <w:t xml:space="preserve"/>
+      </w:r>
+    </w:p>
+    <w:p>
+      <w:pPr>
+        <w:jc w:val="center"/>
+      </w:pPr>
+      <w:r>
+        <w:rPr>
+          <w:rFonts w:ascii="Helvetica Neue" w:hAnsi="Helvetica Neue" w:cs="Helvetica Neue"/>
+          <w:sz w:val="24"/>
+          <w:sz-cs w:val="24"/>
+          <w:spacing w:val="0"/>
+          <w:color w:val="0D121F"/>
+        </w:rPr>
+        <w:t xml:space="preserve"/>
+      </w:r>
+      <w:r>
+        <w:rPr>
+          <w:rFonts w:ascii="Helvetica Neue" w:hAnsi="Helvetica Neue" w:cs="Helvetica Neue"/>
+          <w:sz w:val="24"/>
+          <w:sz-cs w:val="24"/>
+          <w:spacing w:val="0"/>
+          <w:color w:val="0D121F"/>
+        </w:rPr>
+        <w:t xml:space="preserve"/>
+      </w:r>
+    </w:p>
+    <w:p>
+      <w:pPr>
+        <w:spacing w:after="160"/>
+      </w:pPr>
+      <w:r>
+        <w:rPr>
+          <w:rFonts w:ascii="Helvetica Neue" w:hAnsi="Helvetica Neue" w:cs="Helvetica Neue"/>
+          <w:sz w:val="27"/>
+          <w:sz-cs w:val="27"/>
+          <w:b/>
+          <w:i/>
+          <w:spacing w:val="0"/>
+          <w:color w:val="64270E"/>
+        </w:rPr>
+        <w:t xml:space="preserve">Leyenda oficial:</w:t>
+      </w:r>
+      <w:r>
+        <w:rPr>
+          <w:rFonts w:ascii="Helvetica Neue" w:hAnsi="Helvetica Neue" w:cs="Helvetica Neue"/>
+          <w:sz w:val="27"/>
+          <w:sz-cs w:val="27"/>
+          <w:i/>
+          <w:spacing w:val="0"/>
+          <w:color w:val="64270E"/>
+        </w:rPr>
+        <w:t xml:space="preserve"> Estructura canónica de las 18 Densidades Relacionales: Base elemental (D1..D4, SDR, BDR) y los 3 Prismas Duales: Prisma 1 Operativo (D12 Emisor / D34 Receptor), Prisma 2 Ontológico (D14 Expectativas / D23 Hechos) y Prisma 3 Dialéctico (D13 Realismo / D24 Compromiso), con su doble lectura de densidad relativa (S) y masa absoluta (B).</w:t>
+      </w:r>
+      <w:r>
+        <w:rPr>
+          <w:rFonts w:ascii="Helvetica Neue" w:hAnsi="Helvetica Neue" w:cs="Helvetica Neue"/>
+          <w:sz w:val="27"/>
+          <w:sz-cs w:val="27"/>
+          <w:i/>
+          <w:spacing w:val="0"/>
+          <w:color w:val="64270E"/>
+        </w:rPr>
+        <w:t xml:space="preserve"/>
+      </w:r>
+    </w:p>
+    <w:p>
+      <w:pPr/>
+      <w:r>
+        <w:rPr>
+          <w:rFonts w:ascii="Helvetica Neue" w:hAnsi="Helvetica Neue" w:cs="Helvetica Neue"/>
+          <w:sz w:val="25"/>
+          <w:sz-cs w:val="25"/>
+          <w:b/>
+          <w:spacing w:val="0"/>
+          <w:color w:val="351304"/>
+        </w:rPr>
+        <w:t xml:space="preserve">Función metodológica:</w:t>
+      </w:r>
+      <w:r>
+        <w:rPr>
+          <w:rFonts w:ascii="Helvetica Neue" w:hAnsi="Helvetica Neue" w:cs="Helvetica Neue"/>
+          <w:sz w:val="25"/>
+          <w:sz-cs w:val="25"/>
+          <w:spacing w:val="0"/>
+          <w:color w:val="351304"/>
+        </w:rPr>
+        <w:t xml:space="preserve"> Marco de descomposición dimensional que formaliza el desacoplamiento entre intención proactiva, impacto conductual y balance de rol.</w:t>
+      </w:r>
+      <w:r>
+        <w:rPr>
+          <w:rFonts w:ascii="Helvetica Neue" w:hAnsi="Helvetica Neue" w:cs="Helvetica Neue"/>
+          <w:sz w:val="25"/>
+          <w:sz-cs w:val="25"/>
+          <w:spacing w:val="0"/>
+          <w:color w:val="351304"/>
+        </w:rPr>
+        <w:t xml:space="preserve"/>
+      </w:r>
+    </w:p>
+    <w:p>
+      <w:pPr/>
+      <w:r>
+        <w:rPr>
+          <w:rFonts w:ascii=".SF NS" w:hAnsi=".SF NS" w:cs=".SF NS"/>
+          <w:sz w:val="24"/>
+          <w:sz-cs w:val="24"/>
+          <w:b/>
+          <w:spacing w:val="0"/>
+          <w:color w:val="13645B"/>
+        </w:rPr>
         <w:t xml:space="preserve">FIGURA 3</w:t>
       </w:r>
     </w:p>
@@ -1009,7 +1657,7 @@
           <w:spacing w:val="0"/>
           <w:color w:val="64270E"/>
         </w:rPr>
-        <w:t xml:space="preserve"> Figura 3. Arquitectura del Espacio Relacional 18D y los 3 Prismas Duales: Estructuración del tetragrama en 4 densidades elementales (D1–D4), saldos globales invariantes (SDR, BDR, I_desgaste) y descomposición en los tres ejes fundamentales: Operativo (10D), Ontológico (14D) y Dialéctico (18D).</w:t>
+        <w:t xml:space="preserve"> Figura 3. Esquema gráfico vectorial de las 18 densidades vinculares y los 3 prismas duales en paleta crema (#FCFAF6): descomposición del tetragrama en 4 densidades básicas, saldos globales invariantes y ejes funcional-estructurales.</w:t>
       </w:r>
       <w:r>
         <w:rPr>
@@ -1044,7 +1692,7 @@
           <w:spacing w:val="0"/>
           <w:color w:val="351304"/>
         </w:rPr>
-        <w:t xml:space="preserve"> Gráfico canónico de alta precisión actualizado en paleta crema editorial (#FDFBF7), verificando el cálculo exacto de cada balance sin confusión con SDA/SRC.</w:t>
+        <w:t xml:space="preserve"> Visualización estructural de alta precisión que verifica la coherencia entre las 18 magnitudes relacionales.</w:t>
       </w:r>
       <w:r>
         <w:rPr>
@@ -1082,32 +1730,32 @@
           <w:spacing w:val="0"/>
           <w:color w:val="526078"/>
         </w:rPr>
-        <w:t xml:space="preserve">Sección 4.4.1 y 4.4.2: Las 18 Densidades Relacionales y Desniveles de Tensión (Δ)</w:t>
-      </w:r>
-      <w:r>
-        <w:rPr>
-          <w:rFonts w:ascii=".SF NS" w:hAnsi=".SF NS" w:cs=".SF NS"/>
-          <w:sz w:val="26"/>
-          <w:sz-cs w:val="26"/>
-          <w:b/>
-          <w:spacing w:val="0"/>
-          <w:color w:val="526078"/>
-        </w:rPr>
-        <w:t xml:space="preserve"/>
-      </w:r>
-    </w:p>
-    <w:p>
-      <w:pPr/>
-      <w:r>
-        <w:rPr>
-          <w:rFonts w:ascii="Helvetica Neue" w:hAnsi="Helvetica Neue" w:cs="Helvetica Neue"/>
-          <w:sz w:val="40"/>
-          <w:sz-cs w:val="40"/>
-          <w:b/>
-          <w:spacing w:val="0"/>
-          <w:color w:val="171E2D"/>
-        </w:rPr>
-        <w:t xml:space="preserve">Gráfica Compuesta 18D. Espectrograma Panorámico de la Energía Vincular (4 Macro-Áreas en Colores Suaves)</w:t>
+        <w:t xml:space="preserve">Sección 4.4.1 y 4.4.2: Espectro Continuo y Desniveles de Tensión Relacional (Δ)</w:t>
+      </w:r>
+      <w:r>
+        <w:rPr>
+          <w:rFonts w:ascii=".SF NS" w:hAnsi=".SF NS" w:cs=".SF NS"/>
+          <w:sz w:val="26"/>
+          <w:sz-cs w:val="26"/>
+          <w:b/>
+          <w:spacing w:val="0"/>
+          <w:color w:val="526078"/>
+        </w:rPr>
+        <w:t xml:space="preserve"/>
+      </w:r>
+    </w:p>
+    <w:p>
+      <w:pPr/>
+      <w:r>
+        <w:rPr>
+          <w:rFonts w:ascii="Helvetica Neue" w:hAnsi="Helvetica Neue" w:cs="Helvetica Neue"/>
+          <w:sz w:val="40"/>
+          <w:sz-cs w:val="40"/>
+          <w:b/>
+          <w:spacing w:val="0"/>
+          <w:color w:val="171E2D"/>
+        </w:rPr>
+        <w:t xml:space="preserve">Figura 3b. Espectrograma Panorámico 18D de la Energía Vincular (4 Macro-Áreas en Fondos Pastel)</w:t>
       </w:r>
       <w:r>
         <w:rPr>
@@ -1171,7 +1819,7 @@
           <w:spacing w:val="0"/>
           <w:color w:val="64270E"/>
         </w:rPr>
-        <w:t xml:space="preserve"> Espectrograma Panorámico 18D en Ordenación Canónica Nº 1: B12 S12 (DA) · B14 S14 (PA) · B13 S13 (XA) · [d1 d2 d3 d4] · S24 B24 (XR) · S23 B23 (PR) · S34 B34 (RC) · SDR BDR. Las 4 macro-áreas estructuran el campo en fondos suaves armonizados: 1) DA (Polo Emisor / Expectativas); 2) Núcleo Tetragrama (d1..d4); 3) RC (Polo Receptor / Hechos Fácticos); y 4) BDR-SDR (Invariantes Globales y Fricción Térmica Φ). La franja sombreada entre cada masa bruta (B) y su saldo relativo (S) cuantifica el desnivel de fricción térmica (Δ = B − S ≡ Φ).</w:t>
+        <w:t xml:space="preserve"> Espectrograma Panorámico 18D en Ordenación Canónica Nº 1: B12 S12 (DA) · B14 S14 (PA) · B13 S13 (XA) · [d1 d2 d3 d4] · S24 B24 (XR) · S23 B23 (PR) · S34 B34 (RC) · SDR BDR. Las 4 macro-áreas estructuran el campo en fondos suaves armonizados: 1) DA (Polo Emisor / Expectativas); 2) Núcleo Tetragrama (d1..d4); 3) RC (Polo Receptor / Hechos Fácticos); y 4) BDR-SDR (Invariantes Globales y Fricción Relacional Φ). La franja sombreada entre cada masa bruta (B) y su saldo neto (S) cuantifica el desnivel relacional (Δ = B − S).</w:t>
       </w:r>
       <w:r>
         <w:rPr>
@@ -1206,7 +1854,7 @@
           <w:spacing w:val="0"/>
           <w:color w:val="351304"/>
         </w:rPr>
-        <w:t xml:space="preserve"> Proyección panorámica simultánea de las 18 dimensiones vinculares en un único continuo, integrando el cálculo de fricción térmica disipativa estructurada en 4 macro-áreas con fondos pastel armonizados.</w:t>
+        <w:t xml:space="preserve"> Proyección panorámica simultánea de las 18 dimensiones vinculares en un único continuo, integrando el cálculo de asimetría relacional y fricción estructural.</w:t>
       </w:r>
       <w:r>
         <w:rPr>

</xml_diff>

<commit_message>
docs(assets): sync executive summary PDFs and chained tables v9.1.1 to web
</commit_message>
<xml_diff>
--- a/assets/TABLAS_Y_GRAFICOS_ENCADENADOS_NEXORD.docx
+++ b/assets/TABLAS_Y_GRAFICOS_ENCADENADOS_NEXORD.docx
@@ -69,7 +69,7 @@
           <w:spacing w:val="0"/>
           <w:color w:val="374356"/>
         </w:rPr>
-        <w:t xml:space="preserve">Colección Exhaustiva de Entregables Gráficos y Tabulares del Manifiesto Científico (v9.0)</w:t>
+        <w:t xml:space="preserve">Colección Exhaustiva de Entregables Gráficos y Tabulares del Manifiesto Científico (Edición Canónica v9.1.1)</w:t>
       </w:r>
       <w:r>
         <w:rPr>
@@ -141,7 +141,7 @@
           <w:spacing w:val="0"/>
           <w:color w:val="273143"/>
         </w:rPr>
-        <w:t xml:space="preserve"> 10.5281/zenodo.18926396 · </w:t>
+        <w:t xml:space="preserve"> 10.5281/zenodo.23329641 · </w:t>
       </w:r>
       <w:r>
         <w:rPr>
@@ -152,7 +152,7 @@
           <w:spacing w:val="0"/>
           <w:color w:val="273143"/>
         </w:rPr>
-        <w:t xml:space="preserve">DOI de Edición:</w:t>
+        <w:t xml:space="preserve">DOI de Edición v9.1.1:</w:t>
       </w:r>
       <w:r>
         <w:rPr>
@@ -162,7 +162,7 @@
           <w:spacing w:val="0"/>
           <w:color w:val="273143"/>
         </w:rPr>
-        <w:t xml:space="preserve"> 10.5281/zenodo.18941691</w:t>
+        <w:t xml:space="preserve"> 10.5281/zenodo.23329641</w:t>
       </w:r>
       <w:r>
         <w:rPr>

</xml_diff>